<commit_message>
track transformation module edits
</commit_message>
<xml_diff>
--- a/phoebechar/track/transformation_module/Track_TransformationModule_Worksheet.docx
+++ b/phoebechar/track/transformation_module/Track_TransformationModule_Worksheet.docx
@@ -20,7 +20,7 @@
           <w:szCs w:val="26"/>
           <w:rtl w:val="0"/>
         </w:rPr>
-        <w:t xml:space="preserve">NCAA Division 1 Women’s Track: Using Transformations</w:t>
+        <w:t xml:space="preserve">NCAA D1 Women's Track: Fixing Non-Linear Data with a Log Transformation</w:t>
       </w:r>
     </w:p>
     <w:p>
@@ -120,7 +120,72 @@
           <w:szCs w:val="24"/>
           <w:rtl w:val="0"/>
         </w:rPr>
-        <w:t xml:space="preserve">Make a scatterplot using distance (Event) to predict speed</w:t>
+        <w:t xml:space="preserve">Define a model using distance (Event) to predict speed and interpret the R-squared for the model.</w:t>
+      </w:r>
+    </w:p>
+    <w:p>
+      <w:pPr>
+        <w:rPr>
+          <w:rFonts w:ascii="Calibri" w:cs="Calibri" w:eastAsia="Calibri" w:hAnsi="Calibri"/>
+          <w:sz w:val="24"/>
+          <w:szCs w:val="24"/>
+        </w:rPr>
+      </w:pPr>
+      <w:r>
+        <w:rPr>
+          <w:rtl w:val="0"/>
+        </w:rPr>
+      </w:r>
+    </w:p>
+    <w:p>
+      <w:pPr>
+        <w:rPr>
+          <w:rFonts w:ascii="Calibri" w:cs="Calibri" w:eastAsia="Calibri" w:hAnsi="Calibri"/>
+          <w:sz w:val="24"/>
+          <w:szCs w:val="24"/>
+        </w:rPr>
+      </w:pPr>
+      <w:r>
+        <w:rPr>
+          <w:rtl w:val="0"/>
+        </w:rPr>
+      </w:r>
+    </w:p>
+    <w:p>
+      <w:pPr>
+        <w:rPr>
+          <w:rFonts w:ascii="Calibri" w:cs="Calibri" w:eastAsia="Calibri" w:hAnsi="Calibri"/>
+          <w:sz w:val="24"/>
+          <w:szCs w:val="24"/>
+        </w:rPr>
+      </w:pPr>
+      <w:r>
+        <w:rPr>
+          <w:rtl w:val="0"/>
+        </w:rPr>
+      </w:r>
+    </w:p>
+    <w:p>
+      <w:pPr>
+        <w:numPr>
+          <w:ilvl w:val="0"/>
+          <w:numId w:val="1"/>
+        </w:numPr>
+        <w:ind w:left="720" w:hanging="360"/>
+        <w:rPr>
+          <w:rFonts w:ascii="Calibri" w:cs="Calibri" w:eastAsia="Calibri" w:hAnsi="Calibri"/>
+          <w:sz w:val="24"/>
+          <w:szCs w:val="24"/>
+        </w:rPr>
+      </w:pPr>
+      <w:r>
+        <w:rPr>
+          <w:rFonts w:ascii="Calibri" w:cs="Calibri" w:eastAsia="Calibri" w:hAnsi="Calibri"/>
+          <w:sz w:val="24"/>
+          <w:szCs w:val="24"/>
+          <w:rtl w:val="0"/>
+        </w:rPr>
+        <w:t xml:space="preserve">Make a scatterplot representing the model you defined.</w:t>
       </w:r>
     </w:p>
     <w:p>
@@ -347,6 +412,91 @@
     </w:p>
     <w:p>
       <w:pPr>
+        <w:spacing w:after="0" w:before="0" w:lineRule="auto"/>
+        <w:rPr>
+          <w:rFonts w:ascii="Calibri" w:cs="Calibri" w:eastAsia="Calibri" w:hAnsi="Calibri"/>
+          <w:sz w:val="24"/>
+          <w:szCs w:val="24"/>
+        </w:rPr>
+      </w:pPr>
+      <w:r>
+        <w:rPr>
+          <w:rtl w:val="0"/>
+        </w:rPr>
+      </w:r>
+    </w:p>
+    <w:p>
+      <w:pPr>
+        <w:numPr>
+          <w:ilvl w:val="0"/>
+          <w:numId w:val="1"/>
+        </w:numPr>
+        <w:spacing w:after="0" w:before="0" w:lineRule="auto"/>
+        <w:ind w:left="720" w:hanging="360"/>
+        <w:rPr>
+          <w:rFonts w:ascii="Calibri" w:cs="Calibri" w:eastAsia="Calibri" w:hAnsi="Calibri"/>
+          <w:sz w:val="24"/>
+          <w:szCs w:val="24"/>
+          <w:u w:val="none"/>
+        </w:rPr>
+      </w:pPr>
+      <w:r>
+        <w:rPr>
+          <w:rFonts w:ascii="Calibri" w:cs="Calibri" w:eastAsia="Calibri" w:hAnsi="Calibri"/>
+          <w:sz w:val="24"/>
+          <w:szCs w:val="24"/>
+          <w:rtl w:val="0"/>
+        </w:rPr>
+        <w:t xml:space="preserve">Interpret the R-squared for this model and compare it to the R-squared from question 1.</w:t>
+      </w:r>
+    </w:p>
+    <w:p>
+      <w:pPr>
+        <w:spacing w:after="0" w:before="0" w:lineRule="auto"/>
+        <w:rPr>
+          <w:rFonts w:ascii="Calibri" w:cs="Calibri" w:eastAsia="Calibri" w:hAnsi="Calibri"/>
+          <w:sz w:val="24"/>
+          <w:szCs w:val="24"/>
+        </w:rPr>
+      </w:pPr>
+      <w:r>
+        <w:rPr>
+          <w:rtl w:val="0"/>
+        </w:rPr>
+      </w:r>
+    </w:p>
+    <w:p>
+      <w:pPr>
+        <w:spacing w:after="0" w:before="0" w:lineRule="auto"/>
+        <w:rPr>
+          <w:rFonts w:ascii="Calibri" w:cs="Calibri" w:eastAsia="Calibri" w:hAnsi="Calibri"/>
+          <w:sz w:val="24"/>
+          <w:szCs w:val="24"/>
+        </w:rPr>
+      </w:pPr>
+      <w:r>
+        <w:rPr>
+          <w:rtl w:val="0"/>
+        </w:rPr>
+      </w:r>
+    </w:p>
+    <w:p>
+      <w:pPr>
+        <w:spacing w:after="0" w:before="0" w:lineRule="auto"/>
+        <w:rPr>
+          <w:rFonts w:ascii="Calibri" w:cs="Calibri" w:eastAsia="Calibri" w:hAnsi="Calibri"/>
+          <w:sz w:val="24"/>
+          <w:szCs w:val="24"/>
+        </w:rPr>
+      </w:pPr>
+      <w:r>
+        <w:rPr>
+          <w:rtl w:val="0"/>
+        </w:rPr>
+      </w:r>
+    </w:p>
+    <w:p>
+      <w:pPr>
         <w:numPr>
           <w:ilvl w:val="0"/>
           <w:numId w:val="1"/>
@@ -408,6 +558,24 @@
         <w:rPr>
           <w:rtl w:val="0"/>
         </w:rPr>
+      </w:r>
+    </w:p>
+    <w:p>
+      <w:pPr>
+        <w:rPr>
+          <w:rFonts w:ascii="Calibri" w:cs="Calibri" w:eastAsia="Calibri" w:hAnsi="Calibri"/>
+          <w:sz w:val="24"/>
+          <w:szCs w:val="24"/>
+        </w:rPr>
+      </w:pPr>
+      <w:r>
+        <w:rPr>
+          <w:rFonts w:ascii="Calibri" w:cs="Calibri" w:eastAsia="Calibri" w:hAnsi="Calibri"/>
+          <w:sz w:val="24"/>
+          <w:szCs w:val="24"/>
+          <w:rtl w:val="0"/>
+        </w:rPr>
+        <w:t xml:space="preserve">Look back at your scatterplots and notice that despite the increased appropriateness of the transformed model, the data still has some curvature. In the future, there may be another strategy to use with data like this that will result in a more accurate and appropriate model.</w:t>
       </w:r>
     </w:p>
     <w:sectPr>
@@ -422,24 +590,6 @@
 
 <file path=word/footer1.xml><?xml version="1.0" encoding="utf-8"?>
 <w:ftr xmlns:mc="http://schemas.openxmlformats.org/markup-compatibility/2006" xmlns:o="urn:schemas-microsoft-com:office:office" xmlns:r="http://schemas.openxmlformats.org/officeDocument/2006/relationships" xmlns:m="http://schemas.openxmlformats.org/officeDocument/2006/math" xmlns:v="urn:schemas-microsoft-com:vml" xmlns:wp="http://schemas.openxmlformats.org/drawingml/2006/wordprocessingDrawing" xmlns:w10="urn:schemas-microsoft-com:office:word" xmlns:w="http://schemas.openxmlformats.org/wordprocessingml/2006/main" xmlns:wne="http://schemas.microsoft.com/office/word/2006/wordml" xmlns:sl="http://schemas.openxmlformats.org/schemaLibrary/2006/main" xmlns:a="http://schemas.openxmlformats.org/drawingml/2006/main" xmlns:pic="http://schemas.openxmlformats.org/drawingml/2006/picture" xmlns:c="http://schemas.openxmlformats.org/drawingml/2006/chart" xmlns:lc="http://schemas.openxmlformats.org/drawingml/2006/lockedCanvas" xmlns:dgm="http://schemas.openxmlformats.org/drawingml/2006/diagram" xmlns:wps="http://schemas.microsoft.com/office/word/2010/wordprocessingShape" xmlns:wpg="http://schemas.microsoft.com/office/word/2010/wordprocessingGroup" xmlns:w14="http://schemas.microsoft.com/office/word/2010/wordml" xmlns:w15="http://schemas.microsoft.com/office/word/2012/wordml" xmlns:w16="http://schemas.microsoft.com/office/word/2018/wordml" xmlns:w16cex="http://schemas.microsoft.com/office/word/2018/wordml/cex" xmlns:w16cid="http://schemas.microsoft.com/office/word/2016/wordml/cid" xmlns="http://schemas.microsoft.com/office/tasks/2019/documenttasks" xmlns:cr="http://schemas.microsoft.com/office/comments/2020/reactions">
-  <w:p>
-    <w:pPr>
-      <w:rPr>
-        <w:rFonts w:ascii="Calibri" w:cs="Calibri" w:eastAsia="Calibri" w:hAnsi="Calibri"/>
-        <w:sz w:val="24"/>
-        <w:szCs w:val="24"/>
-      </w:rPr>
-    </w:pPr>
-    <w:r>
-      <w:rPr>
-        <w:rFonts w:ascii="Calibri" w:cs="Calibri" w:eastAsia="Calibri" w:hAnsi="Calibri"/>
-        <w:sz w:val="24"/>
-        <w:szCs w:val="24"/>
-        <w:rtl w:val="0"/>
-      </w:rPr>
-      <w:t xml:space="preserve">Look back at your scatterplot and notice that despite the increased appropriateness of a linear model, the data still has some curvature. In the future, there may be another strategy to use with data like this that will result in a more accurate and appropriate model.</w:t>
-    </w:r>
-  </w:p>
   <w:p>
     <w:pPr>
       <w:rPr/>

</xml_diff>